<commit_message>
master order sales report
</commit_message>
<xml_diff>
--- a/APLOS/POPResources/Templates/LocalTaxInvoice20204.docx
+++ b/APLOS/POPResources/Templates/LocalTaxInvoice20204.docx
@@ -1,6 +1,6 @@
 
 <file path=word/document.xml><?xml version="1.0" encoding="utf-8"?>
-<w:document xmlns:wpc="http://schemas.microsoft.com/office/word/2010/wordprocessingCanvas" xmlns:cx="http://schemas.microsoft.com/office/drawing/2014/chartex" xmlns:cx1="http://schemas.microsoft.com/office/drawing/2015/9/8/chartex" xmlns:cx2="http://schemas.microsoft.com/office/drawing/2015/10/21/chartex" xmlns:cx3="http://schemas.microsoft.com/office/drawing/2016/5/9/chartex" xmlns:cx4="http://schemas.microsoft.com/office/drawing/2016/5/10/chartex" xmlns:cx5="http://schemas.microsoft.com/office/drawing/2016/5/11/chartex" xmlns:cx6="http://schemas.microsoft.com/office/drawing/2016/5/12/chartex" xmlns:cx7="http://schemas.microsoft.com/office/drawing/2016/5/13/chartex" xmlns:cx8="http://schemas.microsoft.com/office/drawing/2016/5/14/chartex" xmlns:mc="http://schemas.openxmlformats.org/markup-compatibility/2006" xmlns:aink="http://schemas.microsoft.com/office/drawing/2016/ink" xmlns:am3d="http://schemas.microsoft.com/office/drawing/2017/model3d" xmlns:o="urn:schemas-microsoft-com:office:office" xmlns:r="http://schemas.openxmlformats.org/officeDocument/2006/relationships" xmlns:m="http://schemas.openxmlformats.org/officeDocument/2006/math" xmlns:v="urn:schemas-microsoft-com:vml" xmlns:wp14="http://schemas.microsoft.com/office/word/2010/wordprocessingDrawing" xmlns:wp="http://schemas.openxmlformats.org/drawingml/2006/wordprocessingDrawing" xmlns:w10="urn:schemas-microsoft-com:office:word" xmlns:w="http://schemas.openxmlformats.org/wordprocessingml/2006/main" xmlns:w14="http://schemas.microsoft.com/office/word/2010/wordml" xmlns:w15="http://schemas.microsoft.com/office/word/2012/wordml" xmlns:w16cex="http://schemas.microsoft.com/office/word/2018/wordml/cex" xmlns:w16cid="http://schemas.microsoft.com/office/word/2016/wordml/cid" xmlns:w16="http://schemas.microsoft.com/office/word/2018/wordml" xmlns:w16sdtdh="http://schemas.microsoft.com/office/word/2020/wordml/sdtdatahash" xmlns:w16se="http://schemas.microsoft.com/office/word/2015/wordml/symex" xmlns:wpg="http://schemas.microsoft.com/office/word/2010/wordprocessingGroup" xmlns:wpi="http://schemas.microsoft.com/office/word/2010/wordprocessingInk" xmlns:wne="http://schemas.microsoft.com/office/word/2006/wordml" xmlns:wps="http://schemas.microsoft.com/office/word/2010/wordprocessingShape" mc:Ignorable="w14 w15 w16se w16cid w16 w16cex w16sdtdh wp14">
+<w:document xmlns:wpc="http://schemas.microsoft.com/office/word/2010/wordprocessingCanvas" xmlns:cx="http://schemas.microsoft.com/office/drawing/2014/chartex" xmlns:cx1="http://schemas.microsoft.com/office/drawing/2015/9/8/chartex" xmlns:cx2="http://schemas.microsoft.com/office/drawing/2015/10/21/chartex" xmlns:cx3="http://schemas.microsoft.com/office/drawing/2016/5/9/chartex" xmlns:cx4="http://schemas.microsoft.com/office/drawing/2016/5/10/chartex" xmlns:cx5="http://schemas.microsoft.com/office/drawing/2016/5/11/chartex" xmlns:cx6="http://schemas.microsoft.com/office/drawing/2016/5/12/chartex" xmlns:cx7="http://schemas.microsoft.com/office/drawing/2016/5/13/chartex" xmlns:cx8="http://schemas.microsoft.com/office/drawing/2016/5/14/chartex" xmlns:mc="http://schemas.openxmlformats.org/markup-compatibility/2006" xmlns:aink="http://schemas.microsoft.com/office/drawing/2016/ink" xmlns:am3d="http://schemas.microsoft.com/office/drawing/2017/model3d" xmlns:o="urn:schemas-microsoft-com:office:office" xmlns:oel="http://schemas.microsoft.com/office/2019/extlst" xmlns:r="http://schemas.openxmlformats.org/officeDocument/2006/relationships" xmlns:m="http://schemas.openxmlformats.org/officeDocument/2006/math" xmlns:v="urn:schemas-microsoft-com:vml" xmlns:wp14="http://schemas.microsoft.com/office/word/2010/wordprocessingDrawing" xmlns:wp="http://schemas.openxmlformats.org/drawingml/2006/wordprocessingDrawing" xmlns:w10="urn:schemas-microsoft-com:office:word" xmlns:w="http://schemas.openxmlformats.org/wordprocessingml/2006/main" xmlns:w14="http://schemas.microsoft.com/office/word/2010/wordml" xmlns:w15="http://schemas.microsoft.com/office/word/2012/wordml" xmlns:w16cex="http://schemas.microsoft.com/office/word/2018/wordml/cex" xmlns:w16cid="http://schemas.microsoft.com/office/word/2016/wordml/cid" xmlns:w16="http://schemas.microsoft.com/office/word/2018/wordml" xmlns:w16du="http://schemas.microsoft.com/office/word/2023/wordml/word16du" xmlns:w16sdtdh="http://schemas.microsoft.com/office/word/2020/wordml/sdtdatahash" xmlns:w16se="http://schemas.microsoft.com/office/word/2015/wordml/symex" xmlns:wpg="http://schemas.microsoft.com/office/word/2010/wordprocessingGroup" xmlns:wpi="http://schemas.microsoft.com/office/word/2010/wordprocessingInk" xmlns:wne="http://schemas.microsoft.com/office/word/2006/wordml" xmlns:wps="http://schemas.microsoft.com/office/word/2010/wordprocessingShape" mc:Ignorable="w14 w15 w16se w16cid w16 w16cex w16sdtdh wp14">
   <w:body>
     <w:tbl>
       <w:tblPr>
@@ -99,7 +99,7 @@
                 <w:sz w:val="20"/>
                 <w:szCs w:val="20"/>
               </w:rPr>
-              <w:t xml:space="preserve">Plot No 615, on Ranchi Tata Road </w:t>
+              <w:t>Plot No 615, on Ranchi Tata Road Vill-</w:t>
             </w:r>
             <w:proofErr w:type="spellStart"/>
             <w:r>
@@ -109,7 +109,7 @@
                 <w:sz w:val="20"/>
                 <w:szCs w:val="20"/>
               </w:rPr>
-              <w:t>Vill-Panch</w:t>
+              <w:t>Panch</w:t>
             </w:r>
             <w:proofErr w:type="spellEnd"/>
             <w:r>
@@ -160,7 +160,6 @@
               </w:rPr>
               <w:t xml:space="preserve"> </w:t>
             </w:r>
-            <w:proofErr w:type="gramStart"/>
             <w:r>
               <w:rPr>
                 <w:rFonts w:ascii="Tahoma" w:hAnsi="Tahoma" w:cs="Tahoma"/>
@@ -171,7 +170,6 @@
               </w:rPr>
               <w:t>PH:-</w:t>
             </w:r>
-            <w:proofErr w:type="gramEnd"/>
             <w:r>
               <w:rPr>
                 <w:rFonts w:ascii="Tahoma" w:hAnsi="Tahoma" w:cs="Tahoma"/>
@@ -267,27 +265,7 @@
                 <w:sz w:val="16"/>
                 <w:szCs w:val="16"/>
               </w:rPr>
-              <w:t xml:space="preserve">GST </w:t>
-            </w:r>
-            <w:proofErr w:type="gramStart"/>
-            <w:r>
-              <w:rPr>
-                <w:rFonts w:ascii="Tahoma" w:hAnsi="Tahoma" w:cs="Tahoma"/>
-                <w:b/>
-                <w:sz w:val="16"/>
-                <w:szCs w:val="16"/>
-              </w:rPr>
-              <w:t>NO :</w:t>
-            </w:r>
-            <w:proofErr w:type="gramEnd"/>
-            <w:r>
-              <w:rPr>
-                <w:rFonts w:ascii="Tahoma" w:hAnsi="Tahoma" w:cs="Tahoma"/>
-                <w:b/>
-                <w:sz w:val="16"/>
-                <w:szCs w:val="16"/>
-              </w:rPr>
-              <w:t xml:space="preserve"> </w:t>
+              <w:t xml:space="preserve">GST NO : </w:t>
             </w:r>
             <w:r>
               <w:rPr>
@@ -608,7 +586,6 @@
               <w:t xml:space="preserve">Customer </w:t>
             </w:r>
             <w:proofErr w:type="spellStart"/>
-            <w:proofErr w:type="gramStart"/>
             <w:r>
               <w:rPr>
                 <w:rFonts w:ascii="Tahoma" w:hAnsi="Tahoma" w:cs="Tahoma"/>
@@ -646,7 +623,6 @@
               </w:rPr>
               <w:t>:-</w:t>
             </w:r>
-            <w:proofErr w:type="gramEnd"/>
             <w:r>
               <w:rPr>
                 <w:rFonts w:ascii="Tahoma" w:hAnsi="Tahoma" w:cs="Tahoma"/>
@@ -708,27 +684,7 @@
                 <w:sz w:val="16"/>
                 <w:szCs w:val="16"/>
               </w:rPr>
-              <w:t xml:space="preserve">PAN </w:t>
-            </w:r>
-            <w:proofErr w:type="gramStart"/>
-            <w:r>
-              <w:rPr>
-                <w:rFonts w:ascii="Tahoma" w:hAnsi="Tahoma" w:cs="Tahoma"/>
-                <w:b/>
-                <w:sz w:val="16"/>
-                <w:szCs w:val="16"/>
-              </w:rPr>
-              <w:t>NO :</w:t>
-            </w:r>
-            <w:proofErr w:type="gramEnd"/>
-            <w:r>
-              <w:rPr>
-                <w:rFonts w:ascii="Tahoma" w:hAnsi="Tahoma" w:cs="Tahoma"/>
-                <w:b/>
-                <w:sz w:val="16"/>
-                <w:szCs w:val="16"/>
-              </w:rPr>
-              <w:t>-</w:t>
+              <w:t>PAN NO :-</w:t>
             </w:r>
             <w:r>
               <w:rPr>
@@ -1209,19 +1165,8 @@
                 <w:sz w:val="16"/>
                 <w:szCs w:val="16"/>
               </w:rPr>
-              <w:t xml:space="preserve">Container </w:t>
-            </w:r>
-            <w:proofErr w:type="gramStart"/>
-            <w:r>
-              <w:rPr>
-                <w:rFonts w:ascii="Tahoma" w:hAnsi="Tahoma" w:cs="Tahoma"/>
-                <w:b/>
-                <w:sz w:val="16"/>
-                <w:szCs w:val="16"/>
-              </w:rPr>
-              <w:t>No :</w:t>
-            </w:r>
-            <w:proofErr w:type="gramEnd"/>
+              <w:t>Container No :</w:t>
+            </w:r>
             <w:r>
               <w:rPr>
                 <w:rFonts w:ascii="Tahoma" w:hAnsi="Tahoma" w:cs="Tahoma"/>
@@ -1561,7 +1506,6 @@
               </w:rPr>
               <w:t xml:space="preserve">Transport Doc </w:t>
             </w:r>
-            <w:proofErr w:type="gramStart"/>
             <w:r>
               <w:rPr>
                 <w:rFonts w:ascii="Tahoma" w:hAnsi="Tahoma" w:cs="Tahoma"/>
@@ -1583,7 +1527,6 @@
               <w:t>{</w:t>
             </w:r>
             <w:proofErr w:type="spellStart"/>
-            <w:proofErr w:type="gramEnd"/>
             <w:r>
               <w:rPr>
                 <w:rFonts w:ascii="Consolas" w:hAnsi="Consolas" w:cs="Consolas"/>
@@ -1758,8 +1701,9 @@
           <w:p>
             <w:pPr>
               <w:rPr>
-                <w:rFonts w:ascii="Tahoma" w:hAnsi="Tahoma" w:cs="Tahoma"/>
-                <w:b/>
+                <w:rFonts w:ascii="Tahoma" w:eastAsia="Arial" w:hAnsi="Tahoma" w:cs="Tahoma"/>
+                <w:b/>
+                <w:bCs/>
                 <w:sz w:val="16"/>
                 <w:szCs w:val="16"/>
               </w:rPr>
@@ -1963,7 +1907,6 @@
                 <w:szCs w:val="16"/>
               </w:rPr>
             </w:pPr>
-            <w:proofErr w:type="gramStart"/>
             <w:r>
               <w:rPr>
                 <w:rFonts w:ascii="Tahoma" w:eastAsia="Arial" w:hAnsi="Tahoma" w:cs="Tahoma"/>
@@ -1972,9 +1915,9 @@
                 <w:sz w:val="16"/>
                 <w:szCs w:val="16"/>
               </w:rPr>
-              <w:t>Total :</w:t>
-            </w:r>
-            <w:proofErr w:type="gramEnd"/>
+              <w:t>Total : {</w:t>
+            </w:r>
+            <w:proofErr w:type="spellStart"/>
             <w:r>
               <w:rPr>
                 <w:rFonts w:ascii="Tahoma" w:eastAsia="Arial" w:hAnsi="Tahoma" w:cs="Tahoma"/>
@@ -1983,7 +1926,38 @@
                 <w:sz w:val="16"/>
                 <w:szCs w:val="16"/>
               </w:rPr>
-              <w:t xml:space="preserve"> {</w:t>
+              <w:t>GrandTotal</w:t>
+            </w:r>
+            <w:proofErr w:type="spellEnd"/>
+            <w:r>
+              <w:rPr>
+                <w:rFonts w:ascii="Tahoma" w:eastAsia="Arial" w:hAnsi="Tahoma" w:cs="Tahoma"/>
+                <w:b/>
+                <w:bCs/>
+                <w:sz w:val="16"/>
+                <w:szCs w:val="16"/>
+              </w:rPr>
+              <w:t>}</w:t>
+            </w:r>
+          </w:p>
+          <w:p>
+            <w:pPr>
+              <w:rPr>
+                <w:rFonts w:ascii="Tahoma" w:hAnsi="Tahoma" w:cs="Tahoma"/>
+                <w:b/>
+                <w:sz w:val="16"/>
+                <w:szCs w:val="16"/>
+              </w:rPr>
+            </w:pPr>
+            <w:r>
+              <w:rPr>
+                <w:rFonts w:ascii="Tahoma" w:eastAsia="Arial" w:hAnsi="Tahoma" w:cs="Tahoma"/>
+                <w:b/>
+                <w:bCs/>
+                <w:sz w:val="16"/>
+                <w:szCs w:val="16"/>
+              </w:rPr>
+              <w:t>In Words: {</w:t>
             </w:r>
             <w:proofErr w:type="spellStart"/>
             <w:r>
@@ -1994,7 +1968,7 @@
                 <w:sz w:val="16"/>
                 <w:szCs w:val="16"/>
               </w:rPr>
-              <w:t>GrandTotal</w:t>
+              <w:t>TotalInWords</w:t>
             </w:r>
             <w:proofErr w:type="spellEnd"/>
             <w:r>
@@ -2008,16 +1982,20 @@
               <w:t>}</w:t>
             </w:r>
           </w:p>
-          <w:p>
-            <w:pPr>
-              <w:rPr>
-                <w:rFonts w:ascii="Tahoma" w:hAnsi="Tahoma" w:cs="Tahoma"/>
-                <w:b/>
-                <w:sz w:val="16"/>
-                <w:szCs w:val="16"/>
-              </w:rPr>
-            </w:pPr>
-            <w:r>
+        </w:tc>
+      </w:tr>
+      <w:tr>
+        <w:trPr>
+          <w:trHeight w:val="296"/>
+        </w:trPr>
+        <w:tc>
+          <w:tcPr>
+            <w:tcW w:w="17910" w:type="dxa"/>
+            <w:gridSpan w:val="8"/>
+            <w:vAlign w:val="center"/>
+          </w:tcPr>
+          <w:p>
+            <w:pPr>
               <w:rPr>
                 <w:rFonts w:ascii="Tahoma" w:eastAsia="Arial" w:hAnsi="Tahoma" w:cs="Tahoma"/>
                 <w:b/>
@@ -2025,30 +2003,7 @@
                 <w:sz w:val="16"/>
                 <w:szCs w:val="16"/>
               </w:rPr>
-              <w:t>In Words: {</w:t>
-            </w:r>
-            <w:proofErr w:type="spellStart"/>
-            <w:r>
-              <w:rPr>
-                <w:rFonts w:ascii="Tahoma" w:eastAsia="Arial" w:hAnsi="Tahoma" w:cs="Tahoma"/>
-                <w:b/>
-                <w:bCs/>
-                <w:sz w:val="16"/>
-                <w:szCs w:val="16"/>
-              </w:rPr>
-              <w:t>TotalInWords</w:t>
-            </w:r>
-            <w:proofErr w:type="spellEnd"/>
-            <w:r>
-              <w:rPr>
-                <w:rFonts w:ascii="Tahoma" w:eastAsia="Arial" w:hAnsi="Tahoma" w:cs="Tahoma"/>
-                <w:b/>
-                <w:bCs/>
-                <w:sz w:val="16"/>
-                <w:szCs w:val="16"/>
-              </w:rPr>
-              <w:t>}</w:t>
-            </w:r>
+            </w:pPr>
           </w:p>
         </w:tc>
       </w:tr>
@@ -2111,20 +2066,8 @@
                 <w:sz w:val="16"/>
                 <w:szCs w:val="16"/>
               </w:rPr>
-              <w:t xml:space="preserve">For </w:t>
-            </w:r>
-            <w:proofErr w:type="gramStart"/>
-            <w:r>
-              <w:rPr>
-                <w:rFonts w:ascii="Tahoma" w:hAnsi="Tahoma" w:cs="Tahoma"/>
-                <w:b/>
-                <w:bCs/>
-                <w:sz w:val="16"/>
-                <w:szCs w:val="16"/>
-              </w:rPr>
-              <w:t>Payment :</w:t>
-            </w:r>
-            <w:proofErr w:type="gramEnd"/>
+              <w:t>For Payment :</w:t>
+            </w:r>
           </w:p>
         </w:tc>
         <w:tc>
@@ -2154,20 +2097,8 @@
                 <w:sz w:val="16"/>
                 <w:szCs w:val="16"/>
               </w:rPr>
-              <w:t xml:space="preserve">Bank </w:t>
-            </w:r>
-            <w:proofErr w:type="gramStart"/>
-            <w:r>
-              <w:rPr>
-                <w:rFonts w:ascii="Tahoma" w:hAnsi="Tahoma" w:cs="Tahoma"/>
-                <w:b/>
-                <w:bCs/>
-                <w:sz w:val="16"/>
-                <w:szCs w:val="16"/>
-              </w:rPr>
-              <w:t>Name :</w:t>
-            </w:r>
-            <w:proofErr w:type="gramEnd"/>
+              <w:t>Bank Name :</w:t>
+            </w:r>
           </w:p>
         </w:tc>
         <w:tc>
@@ -2247,20 +2178,8 @@
                 <w:sz w:val="16"/>
                 <w:szCs w:val="16"/>
               </w:rPr>
-              <w:t xml:space="preserve">Account </w:t>
-            </w:r>
-            <w:proofErr w:type="gramStart"/>
-            <w:r>
-              <w:rPr>
-                <w:rFonts w:ascii="Tahoma" w:hAnsi="Tahoma" w:cs="Tahoma"/>
-                <w:b/>
-                <w:bCs/>
-                <w:sz w:val="16"/>
-                <w:szCs w:val="16"/>
-              </w:rPr>
-              <w:t>No :</w:t>
-            </w:r>
-            <w:proofErr w:type="gramEnd"/>
+              <w:t>Account No :</w:t>
+            </w:r>
           </w:p>
         </w:tc>
         <w:tc>
@@ -2338,7 +2257,6 @@
                 <w:szCs w:val="16"/>
               </w:rPr>
             </w:pPr>
-            <w:proofErr w:type="gramStart"/>
             <w:r>
               <w:rPr>
                 <w:rFonts w:ascii="Tahoma" w:hAnsi="Tahoma" w:cs="Tahoma"/>
@@ -2349,7 +2267,6 @@
               </w:rPr>
               <w:t>Branch :</w:t>
             </w:r>
-            <w:proofErr w:type="gramEnd"/>
           </w:p>
         </w:tc>
         <w:tc>
@@ -2435,29 +2352,7 @@
                 <w:sz w:val="16"/>
                 <w:szCs w:val="16"/>
               </w:rPr>
-              <w:t xml:space="preserve">Bank </w:t>
-            </w:r>
-            <w:proofErr w:type="gramStart"/>
-            <w:r>
-              <w:rPr>
-                <w:rFonts w:ascii="Tahoma" w:hAnsi="Tahoma" w:cs="Tahoma"/>
-                <w:b/>
-                <w:bCs/>
-                <w:sz w:val="16"/>
-                <w:szCs w:val="16"/>
-              </w:rPr>
-              <w:t>Address :</w:t>
-            </w:r>
-            <w:proofErr w:type="gramEnd"/>
-            <w:r>
-              <w:rPr>
-                <w:rFonts w:ascii="Tahoma" w:hAnsi="Tahoma" w:cs="Tahoma"/>
-                <w:b/>
-                <w:bCs/>
-                <w:sz w:val="16"/>
-                <w:szCs w:val="16"/>
-              </w:rPr>
-              <w:t xml:space="preserve"> </w:t>
+              <w:t xml:space="preserve">Bank Address : </w:t>
             </w:r>
           </w:p>
         </w:tc>
@@ -2561,29 +2456,7 @@
                 <w:sz w:val="16"/>
                 <w:szCs w:val="16"/>
               </w:rPr>
-              <w:t xml:space="preserve"> above are true and </w:t>
-            </w:r>
-            <w:proofErr w:type="gramStart"/>
-            <w:r>
-              <w:rPr>
-                <w:rFonts w:ascii="Tahoma" w:hAnsi="Tahoma" w:cs="Tahoma"/>
-                <w:b/>
-                <w:bCs/>
-                <w:sz w:val="16"/>
-                <w:szCs w:val="16"/>
-              </w:rPr>
-              <w:t>correct  and</w:t>
-            </w:r>
-            <w:proofErr w:type="gramEnd"/>
-            <w:r>
-              <w:rPr>
-                <w:rFonts w:ascii="Tahoma" w:hAnsi="Tahoma" w:cs="Tahoma"/>
-                <w:b/>
-                <w:bCs/>
-                <w:sz w:val="16"/>
-                <w:szCs w:val="16"/>
-              </w:rPr>
-              <w:t xml:space="preserve"> the amount indicated  represents the price actually charged  and that there is no flow of additional Consideration directly  from buyers.</w:t>
+              <w:t xml:space="preserve"> above are true and correct  and the amount indicated  represents the price actually charged  and that there is no flow of additional Consideration directly  from buyers.</w:t>
             </w:r>
           </w:p>
           <w:p>
@@ -2710,7 +2583,6 @@
               </w:rPr>
               <w:t xml:space="preserve"> </w:t>
             </w:r>
-            <w:proofErr w:type="gramStart"/>
             <w:r>
               <w:rPr>
                 <w:rFonts w:ascii="Tahoma" w:hAnsi="Tahoma" w:cs="Tahoma"/>
@@ -2750,7 +2622,6 @@
               </w:rPr>
               <w:t>LIMITED</w:t>
             </w:r>
-            <w:proofErr w:type="gramEnd"/>
           </w:p>
         </w:tc>
       </w:tr>
@@ -2804,29 +2675,7 @@
                 <w:sz w:val="16"/>
                 <w:szCs w:val="16"/>
               </w:rPr>
-              <w:t xml:space="preserve"> above are true and </w:t>
-            </w:r>
-            <w:proofErr w:type="gramStart"/>
-            <w:r>
-              <w:rPr>
-                <w:rFonts w:ascii="Tahoma" w:hAnsi="Tahoma" w:cs="Tahoma"/>
-                <w:b/>
-                <w:bCs/>
-                <w:sz w:val="16"/>
-                <w:szCs w:val="16"/>
-              </w:rPr>
-              <w:t>correct  and</w:t>
-            </w:r>
-            <w:proofErr w:type="gramEnd"/>
-            <w:r>
-              <w:rPr>
-                <w:rFonts w:ascii="Tahoma" w:hAnsi="Tahoma" w:cs="Tahoma"/>
-                <w:b/>
-                <w:bCs/>
-                <w:sz w:val="16"/>
-                <w:szCs w:val="16"/>
-              </w:rPr>
-              <w:t xml:space="preserve"> the amount indicated  is provisional and additional consideration  will be received from the buyer on account of .</w:t>
+              <w:t xml:space="preserve"> above are true and correct  and the amount indicated  is provisional and additional consideration  will be received from the buyer on account of .</w:t>
             </w:r>
           </w:p>
           <w:p>
@@ -2920,18 +2769,7 @@
                 <w:sz w:val="16"/>
                 <w:szCs w:val="16"/>
               </w:rPr>
-              <w:t xml:space="preserve">All disputes are subject </w:t>
-            </w:r>
-            <w:proofErr w:type="gramStart"/>
-            <w:r>
-              <w:rPr>
-                <w:rFonts w:ascii="Tahoma" w:hAnsi="Tahoma" w:cs="Tahoma"/>
-                <w:b/>
-                <w:bCs/>
-                <w:sz w:val="16"/>
-                <w:szCs w:val="16"/>
-              </w:rPr>
-              <w:t xml:space="preserve">to </w:t>
+              <w:t xml:space="preserve">All disputes are subject to </w:t>
             </w:r>
             <w:r>
               <w:rPr>
@@ -2952,7 +2790,6 @@
               </w:rPr>
               <w:t>Ranchi</w:t>
             </w:r>
-            <w:proofErr w:type="gramEnd"/>
             <w:r>
               <w:rPr>
                 <w:rFonts w:ascii="Tahoma" w:hAnsi="Tahoma" w:cs="Tahoma"/>
@@ -3036,7 +2873,7 @@
 </file>
 
 <file path=word/endnotes.xml><?xml version="1.0" encoding="utf-8"?>
-<w:endnotes xmlns:wpc="http://schemas.microsoft.com/office/word/2010/wordprocessingCanvas" xmlns:cx="http://schemas.microsoft.com/office/drawing/2014/chartex" xmlns:cx1="http://schemas.microsoft.com/office/drawing/2015/9/8/chartex" xmlns:cx2="http://schemas.microsoft.com/office/drawing/2015/10/21/chartex" xmlns:cx3="http://schemas.microsoft.com/office/drawing/2016/5/9/chartex" xmlns:cx4="http://schemas.microsoft.com/office/drawing/2016/5/10/chartex" xmlns:cx5="http://schemas.microsoft.com/office/drawing/2016/5/11/chartex" xmlns:cx6="http://schemas.microsoft.com/office/drawing/2016/5/12/chartex" xmlns:cx7="http://schemas.microsoft.com/office/drawing/2016/5/13/chartex" xmlns:cx8="http://schemas.microsoft.com/office/drawing/2016/5/14/chartex" xmlns:mc="http://schemas.openxmlformats.org/markup-compatibility/2006" xmlns:aink="http://schemas.microsoft.com/office/drawing/2016/ink" xmlns:am3d="http://schemas.microsoft.com/office/drawing/2017/model3d" xmlns:o="urn:schemas-microsoft-com:office:office" xmlns:r="http://schemas.openxmlformats.org/officeDocument/2006/relationships" xmlns:m="http://schemas.openxmlformats.org/officeDocument/2006/math" xmlns:v="urn:schemas-microsoft-com:vml" xmlns:wp14="http://schemas.microsoft.com/office/word/2010/wordprocessingDrawing" xmlns:wp="http://schemas.openxmlformats.org/drawingml/2006/wordprocessingDrawing" xmlns:w10="urn:schemas-microsoft-com:office:word" xmlns:w="http://schemas.openxmlformats.org/wordprocessingml/2006/main" xmlns:w14="http://schemas.microsoft.com/office/word/2010/wordml" xmlns:w15="http://schemas.microsoft.com/office/word/2012/wordml" xmlns:w16cex="http://schemas.microsoft.com/office/word/2018/wordml/cex" xmlns:w16cid="http://schemas.microsoft.com/office/word/2016/wordml/cid" xmlns:w16="http://schemas.microsoft.com/office/word/2018/wordml" xmlns:w16sdtdh="http://schemas.microsoft.com/office/word/2020/wordml/sdtdatahash" xmlns:w16se="http://schemas.microsoft.com/office/word/2015/wordml/symex" xmlns:wpg="http://schemas.microsoft.com/office/word/2010/wordprocessingGroup" xmlns:wpi="http://schemas.microsoft.com/office/word/2010/wordprocessingInk" xmlns:wne="http://schemas.microsoft.com/office/word/2006/wordml" xmlns:wps="http://schemas.microsoft.com/office/word/2010/wordprocessingShape" mc:Ignorable="w14 w15 w16se w16cid w16 w16cex w16sdtdh wp14">
+<w:endnotes xmlns:wpc="http://schemas.microsoft.com/office/word/2010/wordprocessingCanvas" xmlns:cx="http://schemas.microsoft.com/office/drawing/2014/chartex" xmlns:cx1="http://schemas.microsoft.com/office/drawing/2015/9/8/chartex" xmlns:cx2="http://schemas.microsoft.com/office/drawing/2015/10/21/chartex" xmlns:cx3="http://schemas.microsoft.com/office/drawing/2016/5/9/chartex" xmlns:cx4="http://schemas.microsoft.com/office/drawing/2016/5/10/chartex" xmlns:cx5="http://schemas.microsoft.com/office/drawing/2016/5/11/chartex" xmlns:cx6="http://schemas.microsoft.com/office/drawing/2016/5/12/chartex" xmlns:cx7="http://schemas.microsoft.com/office/drawing/2016/5/13/chartex" xmlns:cx8="http://schemas.microsoft.com/office/drawing/2016/5/14/chartex" xmlns:mc="http://schemas.openxmlformats.org/markup-compatibility/2006" xmlns:aink="http://schemas.microsoft.com/office/drawing/2016/ink" xmlns:am3d="http://schemas.microsoft.com/office/drawing/2017/model3d" xmlns:o="urn:schemas-microsoft-com:office:office" xmlns:oel="http://schemas.microsoft.com/office/2019/extlst" xmlns:r="http://schemas.openxmlformats.org/officeDocument/2006/relationships" xmlns:m="http://schemas.openxmlformats.org/officeDocument/2006/math" xmlns:v="urn:schemas-microsoft-com:vml" xmlns:wp14="http://schemas.microsoft.com/office/word/2010/wordprocessingDrawing" xmlns:wp="http://schemas.openxmlformats.org/drawingml/2006/wordprocessingDrawing" xmlns:w10="urn:schemas-microsoft-com:office:word" xmlns:w="http://schemas.openxmlformats.org/wordprocessingml/2006/main" xmlns:w14="http://schemas.microsoft.com/office/word/2010/wordml" xmlns:w15="http://schemas.microsoft.com/office/word/2012/wordml" xmlns:w16cex="http://schemas.microsoft.com/office/word/2018/wordml/cex" xmlns:w16cid="http://schemas.microsoft.com/office/word/2016/wordml/cid" xmlns:w16="http://schemas.microsoft.com/office/word/2018/wordml" xmlns:w16du="http://schemas.microsoft.com/office/word/2023/wordml/word16du" xmlns:w16sdtdh="http://schemas.microsoft.com/office/word/2020/wordml/sdtdatahash" xmlns:w16se="http://schemas.microsoft.com/office/word/2015/wordml/symex" xmlns:wpg="http://schemas.microsoft.com/office/word/2010/wordprocessingGroup" xmlns:wpi="http://schemas.microsoft.com/office/word/2010/wordprocessingInk" xmlns:wne="http://schemas.microsoft.com/office/word/2006/wordml" xmlns:wps="http://schemas.microsoft.com/office/word/2010/wordprocessingShape" mc:Ignorable="w14 w15 w16se w16cid w16 w16cex w16sdtdh wp14">
   <w:endnote w:type="separator" w:id="-1">
     <w:p>
       <w:r>
@@ -3055,7 +2892,7 @@
 </file>
 
 <file path=word/footer1.xml><?xml version="1.0" encoding="utf-8"?>
-<w:ftr xmlns:wpc="http://schemas.microsoft.com/office/word/2010/wordprocessingCanvas" xmlns:cx="http://schemas.microsoft.com/office/drawing/2014/chartex" xmlns:cx1="http://schemas.microsoft.com/office/drawing/2015/9/8/chartex" xmlns:cx2="http://schemas.microsoft.com/office/drawing/2015/10/21/chartex" xmlns:cx3="http://schemas.microsoft.com/office/drawing/2016/5/9/chartex" xmlns:cx4="http://schemas.microsoft.com/office/drawing/2016/5/10/chartex" xmlns:cx5="http://schemas.microsoft.com/office/drawing/2016/5/11/chartex" xmlns:cx6="http://schemas.microsoft.com/office/drawing/2016/5/12/chartex" xmlns:cx7="http://schemas.microsoft.com/office/drawing/2016/5/13/chartex" xmlns:cx8="http://schemas.microsoft.com/office/drawing/2016/5/14/chartex" xmlns:mc="http://schemas.openxmlformats.org/markup-compatibility/2006" xmlns:aink="http://schemas.microsoft.com/office/drawing/2016/ink" xmlns:am3d="http://schemas.microsoft.com/office/drawing/2017/model3d" xmlns:o="urn:schemas-microsoft-com:office:office" xmlns:r="http://schemas.openxmlformats.org/officeDocument/2006/relationships" xmlns:m="http://schemas.openxmlformats.org/officeDocument/2006/math" xmlns:v="urn:schemas-microsoft-com:vml" xmlns:wp14="http://schemas.microsoft.com/office/word/2010/wordprocessingDrawing" xmlns:wp="http://schemas.openxmlformats.org/drawingml/2006/wordprocessingDrawing" xmlns:w10="urn:schemas-microsoft-com:office:word" xmlns:w="http://schemas.openxmlformats.org/wordprocessingml/2006/main" xmlns:w14="http://schemas.microsoft.com/office/word/2010/wordml" xmlns:w15="http://schemas.microsoft.com/office/word/2012/wordml" xmlns:w16cex="http://schemas.microsoft.com/office/word/2018/wordml/cex" xmlns:w16cid="http://schemas.microsoft.com/office/word/2016/wordml/cid" xmlns:w16="http://schemas.microsoft.com/office/word/2018/wordml" xmlns:w16sdtdh="http://schemas.microsoft.com/office/word/2020/wordml/sdtdatahash" xmlns:w16se="http://schemas.microsoft.com/office/word/2015/wordml/symex" xmlns:wpg="http://schemas.microsoft.com/office/word/2010/wordprocessingGroup" xmlns:wpi="http://schemas.microsoft.com/office/word/2010/wordprocessingInk" xmlns:wne="http://schemas.microsoft.com/office/word/2006/wordml" xmlns:wps="http://schemas.microsoft.com/office/word/2010/wordprocessingShape" mc:Ignorable="w14 w15 w16se w16cid w16 w16cex w16sdtdh wp14">
+<w:ftr xmlns:wpc="http://schemas.microsoft.com/office/word/2010/wordprocessingCanvas" xmlns:cx="http://schemas.microsoft.com/office/drawing/2014/chartex" xmlns:cx1="http://schemas.microsoft.com/office/drawing/2015/9/8/chartex" xmlns:cx2="http://schemas.microsoft.com/office/drawing/2015/10/21/chartex" xmlns:cx3="http://schemas.microsoft.com/office/drawing/2016/5/9/chartex" xmlns:cx4="http://schemas.microsoft.com/office/drawing/2016/5/10/chartex" xmlns:cx5="http://schemas.microsoft.com/office/drawing/2016/5/11/chartex" xmlns:cx6="http://schemas.microsoft.com/office/drawing/2016/5/12/chartex" xmlns:cx7="http://schemas.microsoft.com/office/drawing/2016/5/13/chartex" xmlns:cx8="http://schemas.microsoft.com/office/drawing/2016/5/14/chartex" xmlns:mc="http://schemas.openxmlformats.org/markup-compatibility/2006" xmlns:aink="http://schemas.microsoft.com/office/drawing/2016/ink" xmlns:am3d="http://schemas.microsoft.com/office/drawing/2017/model3d" xmlns:o="urn:schemas-microsoft-com:office:office" xmlns:oel="http://schemas.microsoft.com/office/2019/extlst" xmlns:r="http://schemas.openxmlformats.org/officeDocument/2006/relationships" xmlns:m="http://schemas.openxmlformats.org/officeDocument/2006/math" xmlns:v="urn:schemas-microsoft-com:vml" xmlns:wp14="http://schemas.microsoft.com/office/word/2010/wordprocessingDrawing" xmlns:wp="http://schemas.openxmlformats.org/drawingml/2006/wordprocessingDrawing" xmlns:w10="urn:schemas-microsoft-com:office:word" xmlns:w="http://schemas.openxmlformats.org/wordprocessingml/2006/main" xmlns:w14="http://schemas.microsoft.com/office/word/2010/wordml" xmlns:w15="http://schemas.microsoft.com/office/word/2012/wordml" xmlns:w16cex="http://schemas.microsoft.com/office/word/2018/wordml/cex" xmlns:w16cid="http://schemas.microsoft.com/office/word/2016/wordml/cid" xmlns:w16="http://schemas.microsoft.com/office/word/2018/wordml" xmlns:w16du="http://schemas.microsoft.com/office/word/2023/wordml/word16du" xmlns:w16sdtdh="http://schemas.microsoft.com/office/word/2020/wordml/sdtdatahash" xmlns:w16se="http://schemas.microsoft.com/office/word/2015/wordml/symex" xmlns:wpg="http://schemas.microsoft.com/office/word/2010/wordprocessingGroup" xmlns:wpi="http://schemas.microsoft.com/office/word/2010/wordprocessingInk" xmlns:wne="http://schemas.microsoft.com/office/word/2006/wordml" xmlns:wps="http://schemas.microsoft.com/office/word/2010/wordprocessingShape" mc:Ignorable="w14 w15 w16se w16cid w16 w16cex w16sdtdh wp14">
   <w:sdt>
     <w:sdtPr>
       <w:id w:val="1647311531"/>
@@ -3095,7 +2932,7 @@
             <w:szCs w:val="18"/>
             <w:lang w:val="en-IN"/>
           </w:rPr>
-          <w:t xml:space="preserve">Plot No 615, on Ranchi Tata Road </w:t>
+          <w:t>Plot No 615, on Ranchi Tata Road Vill-</w:t>
         </w:r>
         <w:proofErr w:type="spellStart"/>
         <w:r>
@@ -3106,7 +2943,7 @@
             <w:szCs w:val="18"/>
             <w:lang w:val="en-IN"/>
           </w:rPr>
-          <w:t>Vill-Panch</w:t>
+          <w:t>Panch</w:t>
         </w:r>
         <w:proofErr w:type="spellEnd"/>
         <w:r>
@@ -3173,7 +3010,7 @@
 </file>
 
 <file path=word/footnotes.xml><?xml version="1.0" encoding="utf-8"?>
-<w:footnotes xmlns:wpc="http://schemas.microsoft.com/office/word/2010/wordprocessingCanvas" xmlns:cx="http://schemas.microsoft.com/office/drawing/2014/chartex" xmlns:cx1="http://schemas.microsoft.com/office/drawing/2015/9/8/chartex" xmlns:cx2="http://schemas.microsoft.com/office/drawing/2015/10/21/chartex" xmlns:cx3="http://schemas.microsoft.com/office/drawing/2016/5/9/chartex" xmlns:cx4="http://schemas.microsoft.com/office/drawing/2016/5/10/chartex" xmlns:cx5="http://schemas.microsoft.com/office/drawing/2016/5/11/chartex" xmlns:cx6="http://schemas.microsoft.com/office/drawing/2016/5/12/chartex" xmlns:cx7="http://schemas.microsoft.com/office/drawing/2016/5/13/chartex" xmlns:cx8="http://schemas.microsoft.com/office/drawing/2016/5/14/chartex" xmlns:mc="http://schemas.openxmlformats.org/markup-compatibility/2006" xmlns:aink="http://schemas.microsoft.com/office/drawing/2016/ink" xmlns:am3d="http://schemas.microsoft.com/office/drawing/2017/model3d" xmlns:o="urn:schemas-microsoft-com:office:office" xmlns:r="http://schemas.openxmlformats.org/officeDocument/2006/relationships" xmlns:m="http://schemas.openxmlformats.org/officeDocument/2006/math" xmlns:v="urn:schemas-microsoft-com:vml" xmlns:wp14="http://schemas.microsoft.com/office/word/2010/wordprocessingDrawing" xmlns:wp="http://schemas.openxmlformats.org/drawingml/2006/wordprocessingDrawing" xmlns:w10="urn:schemas-microsoft-com:office:word" xmlns:w="http://schemas.openxmlformats.org/wordprocessingml/2006/main" xmlns:w14="http://schemas.microsoft.com/office/word/2010/wordml" xmlns:w15="http://schemas.microsoft.com/office/word/2012/wordml" xmlns:w16cex="http://schemas.microsoft.com/office/word/2018/wordml/cex" xmlns:w16cid="http://schemas.microsoft.com/office/word/2016/wordml/cid" xmlns:w16="http://schemas.microsoft.com/office/word/2018/wordml" xmlns:w16sdtdh="http://schemas.microsoft.com/office/word/2020/wordml/sdtdatahash" xmlns:w16se="http://schemas.microsoft.com/office/word/2015/wordml/symex" xmlns:wpg="http://schemas.microsoft.com/office/word/2010/wordprocessingGroup" xmlns:wpi="http://schemas.microsoft.com/office/word/2010/wordprocessingInk" xmlns:wne="http://schemas.microsoft.com/office/word/2006/wordml" xmlns:wps="http://schemas.microsoft.com/office/word/2010/wordprocessingShape" mc:Ignorable="w14 w15 w16se w16cid w16 w16cex w16sdtdh wp14">
+<w:footnotes xmlns:wpc="http://schemas.microsoft.com/office/word/2010/wordprocessingCanvas" xmlns:cx="http://schemas.microsoft.com/office/drawing/2014/chartex" xmlns:cx1="http://schemas.microsoft.com/office/drawing/2015/9/8/chartex" xmlns:cx2="http://schemas.microsoft.com/office/drawing/2015/10/21/chartex" xmlns:cx3="http://schemas.microsoft.com/office/drawing/2016/5/9/chartex" xmlns:cx4="http://schemas.microsoft.com/office/drawing/2016/5/10/chartex" xmlns:cx5="http://schemas.microsoft.com/office/drawing/2016/5/11/chartex" xmlns:cx6="http://schemas.microsoft.com/office/drawing/2016/5/12/chartex" xmlns:cx7="http://schemas.microsoft.com/office/drawing/2016/5/13/chartex" xmlns:cx8="http://schemas.microsoft.com/office/drawing/2016/5/14/chartex" xmlns:mc="http://schemas.openxmlformats.org/markup-compatibility/2006" xmlns:aink="http://schemas.microsoft.com/office/drawing/2016/ink" xmlns:am3d="http://schemas.microsoft.com/office/drawing/2017/model3d" xmlns:o="urn:schemas-microsoft-com:office:office" xmlns:oel="http://schemas.microsoft.com/office/2019/extlst" xmlns:r="http://schemas.openxmlformats.org/officeDocument/2006/relationships" xmlns:m="http://schemas.openxmlformats.org/officeDocument/2006/math" xmlns:v="urn:schemas-microsoft-com:vml" xmlns:wp14="http://schemas.microsoft.com/office/word/2010/wordprocessingDrawing" xmlns:wp="http://schemas.openxmlformats.org/drawingml/2006/wordprocessingDrawing" xmlns:w10="urn:schemas-microsoft-com:office:word" xmlns:w="http://schemas.openxmlformats.org/wordprocessingml/2006/main" xmlns:w14="http://schemas.microsoft.com/office/word/2010/wordml" xmlns:w15="http://schemas.microsoft.com/office/word/2012/wordml" xmlns:w16cex="http://schemas.microsoft.com/office/word/2018/wordml/cex" xmlns:w16cid="http://schemas.microsoft.com/office/word/2016/wordml/cid" xmlns:w16="http://schemas.microsoft.com/office/word/2018/wordml" xmlns:w16du="http://schemas.microsoft.com/office/word/2023/wordml/word16du" xmlns:w16sdtdh="http://schemas.microsoft.com/office/word/2020/wordml/sdtdatahash" xmlns:w16se="http://schemas.microsoft.com/office/word/2015/wordml/symex" xmlns:wpg="http://schemas.microsoft.com/office/word/2010/wordprocessingGroup" xmlns:wpi="http://schemas.microsoft.com/office/word/2010/wordprocessingInk" xmlns:wne="http://schemas.microsoft.com/office/word/2006/wordml" xmlns:wps="http://schemas.microsoft.com/office/word/2010/wordprocessingShape" mc:Ignorable="w14 w15 w16se w16cid w16 w16cex w16sdtdh wp14">
   <w:footnote w:type="separator" w:id="-1">
     <w:p>
       <w:r>
@@ -3192,7 +3029,7 @@
 </file>
 
 <file path=word/header1.xml><?xml version="1.0" encoding="utf-8"?>
-<w:hdr xmlns:wpc="http://schemas.microsoft.com/office/word/2010/wordprocessingCanvas" xmlns:cx="http://schemas.microsoft.com/office/drawing/2014/chartex" xmlns:cx1="http://schemas.microsoft.com/office/drawing/2015/9/8/chartex" xmlns:cx2="http://schemas.microsoft.com/office/drawing/2015/10/21/chartex" xmlns:cx3="http://schemas.microsoft.com/office/drawing/2016/5/9/chartex" xmlns:cx4="http://schemas.microsoft.com/office/drawing/2016/5/10/chartex" xmlns:cx5="http://schemas.microsoft.com/office/drawing/2016/5/11/chartex" xmlns:cx6="http://schemas.microsoft.com/office/drawing/2016/5/12/chartex" xmlns:cx7="http://schemas.microsoft.com/office/drawing/2016/5/13/chartex" xmlns:cx8="http://schemas.microsoft.com/office/drawing/2016/5/14/chartex" xmlns:mc="http://schemas.openxmlformats.org/markup-compatibility/2006" xmlns:aink="http://schemas.microsoft.com/office/drawing/2016/ink" xmlns:am3d="http://schemas.microsoft.com/office/drawing/2017/model3d" xmlns:o="urn:schemas-microsoft-com:office:office" xmlns:r="http://schemas.openxmlformats.org/officeDocument/2006/relationships" xmlns:m="http://schemas.openxmlformats.org/officeDocument/2006/math" xmlns:v="urn:schemas-microsoft-com:vml" xmlns:wp14="http://schemas.microsoft.com/office/word/2010/wordprocessingDrawing" xmlns:wp="http://schemas.openxmlformats.org/drawingml/2006/wordprocessingDrawing" xmlns:w10="urn:schemas-microsoft-com:office:word" xmlns:w="http://schemas.openxmlformats.org/wordprocessingml/2006/main" xmlns:w14="http://schemas.microsoft.com/office/word/2010/wordml" xmlns:w15="http://schemas.microsoft.com/office/word/2012/wordml" xmlns:w16cex="http://schemas.microsoft.com/office/word/2018/wordml/cex" xmlns:w16cid="http://schemas.microsoft.com/office/word/2016/wordml/cid" xmlns:w16="http://schemas.microsoft.com/office/word/2018/wordml" xmlns:w16sdtdh="http://schemas.microsoft.com/office/word/2020/wordml/sdtdatahash" xmlns:w16se="http://schemas.microsoft.com/office/word/2015/wordml/symex" xmlns:wpg="http://schemas.microsoft.com/office/word/2010/wordprocessingGroup" xmlns:wpi="http://schemas.microsoft.com/office/word/2010/wordprocessingInk" xmlns:wne="http://schemas.microsoft.com/office/word/2006/wordml" xmlns:wps="http://schemas.microsoft.com/office/word/2010/wordprocessingShape" mc:Ignorable="w14 w15 w16se w16cid w16 w16cex w16sdtdh wp14">
+<w:hdr xmlns:wpc="http://schemas.microsoft.com/office/word/2010/wordprocessingCanvas" xmlns:cx="http://schemas.microsoft.com/office/drawing/2014/chartex" xmlns:cx1="http://schemas.microsoft.com/office/drawing/2015/9/8/chartex" xmlns:cx2="http://schemas.microsoft.com/office/drawing/2015/10/21/chartex" xmlns:cx3="http://schemas.microsoft.com/office/drawing/2016/5/9/chartex" xmlns:cx4="http://schemas.microsoft.com/office/drawing/2016/5/10/chartex" xmlns:cx5="http://schemas.microsoft.com/office/drawing/2016/5/11/chartex" xmlns:cx6="http://schemas.microsoft.com/office/drawing/2016/5/12/chartex" xmlns:cx7="http://schemas.microsoft.com/office/drawing/2016/5/13/chartex" xmlns:cx8="http://schemas.microsoft.com/office/drawing/2016/5/14/chartex" xmlns:mc="http://schemas.openxmlformats.org/markup-compatibility/2006" xmlns:aink="http://schemas.microsoft.com/office/drawing/2016/ink" xmlns:am3d="http://schemas.microsoft.com/office/drawing/2017/model3d" xmlns:o="urn:schemas-microsoft-com:office:office" xmlns:oel="http://schemas.microsoft.com/office/2019/extlst" xmlns:r="http://schemas.openxmlformats.org/officeDocument/2006/relationships" xmlns:m="http://schemas.openxmlformats.org/officeDocument/2006/math" xmlns:v="urn:schemas-microsoft-com:vml" xmlns:wp14="http://schemas.microsoft.com/office/word/2010/wordprocessingDrawing" xmlns:wp="http://schemas.openxmlformats.org/drawingml/2006/wordprocessingDrawing" xmlns:w10="urn:schemas-microsoft-com:office:word" xmlns:w="http://schemas.openxmlformats.org/wordprocessingml/2006/main" xmlns:w14="http://schemas.microsoft.com/office/word/2010/wordml" xmlns:w15="http://schemas.microsoft.com/office/word/2012/wordml" xmlns:w16cex="http://schemas.microsoft.com/office/word/2018/wordml/cex" xmlns:w16cid="http://schemas.microsoft.com/office/word/2016/wordml/cid" xmlns:w16="http://schemas.microsoft.com/office/word/2018/wordml" xmlns:w16du="http://schemas.microsoft.com/office/word/2023/wordml/word16du" xmlns:w16sdtdh="http://schemas.microsoft.com/office/word/2020/wordml/sdtdatahash" xmlns:w16se="http://schemas.microsoft.com/office/word/2015/wordml/symex" xmlns:wpg="http://schemas.microsoft.com/office/word/2010/wordprocessingGroup" xmlns:wpi="http://schemas.microsoft.com/office/word/2010/wordprocessingInk" xmlns:wne="http://schemas.microsoft.com/office/word/2006/wordml" xmlns:wps="http://schemas.microsoft.com/office/word/2010/wordprocessingShape" mc:Ignorable="w14 w15 w16se w16cid w16 w16cex w16sdtdh wp14">
   <w:p>
     <w:pPr>
       <w:pStyle w:val="Header"/>
@@ -3411,7 +3248,7 @@
 </file>
 
 <file path=word/numbering.xml><?xml version="1.0" encoding="utf-8"?>
-<w:numbering xmlns:wpc="http://schemas.microsoft.com/office/word/2010/wordprocessingCanvas" xmlns:cx="http://schemas.microsoft.com/office/drawing/2014/chartex" xmlns:cx1="http://schemas.microsoft.com/office/drawing/2015/9/8/chartex" xmlns:cx2="http://schemas.microsoft.com/office/drawing/2015/10/21/chartex" xmlns:cx3="http://schemas.microsoft.com/office/drawing/2016/5/9/chartex" xmlns:cx4="http://schemas.microsoft.com/office/drawing/2016/5/10/chartex" xmlns:cx5="http://schemas.microsoft.com/office/drawing/2016/5/11/chartex" xmlns:cx6="http://schemas.microsoft.com/office/drawing/2016/5/12/chartex" xmlns:cx7="http://schemas.microsoft.com/office/drawing/2016/5/13/chartex" xmlns:cx8="http://schemas.microsoft.com/office/drawing/2016/5/14/chartex" xmlns:mc="http://schemas.openxmlformats.org/markup-compatibility/2006" xmlns:aink="http://schemas.microsoft.com/office/drawing/2016/ink" xmlns:am3d="http://schemas.microsoft.com/office/drawing/2017/model3d" xmlns:o="urn:schemas-microsoft-com:office:office" xmlns:r="http://schemas.openxmlformats.org/officeDocument/2006/relationships" xmlns:m="http://schemas.openxmlformats.org/officeDocument/2006/math" xmlns:v="urn:schemas-microsoft-com:vml" xmlns:wp14="http://schemas.microsoft.com/office/word/2010/wordprocessingDrawing" xmlns:wp="http://schemas.openxmlformats.org/drawingml/2006/wordprocessingDrawing" xmlns:w10="urn:schemas-microsoft-com:office:word" xmlns:w="http://schemas.openxmlformats.org/wordprocessingml/2006/main" xmlns:w14="http://schemas.microsoft.com/office/word/2010/wordml" xmlns:w15="http://schemas.microsoft.com/office/word/2012/wordml" xmlns:w16cex="http://schemas.microsoft.com/office/word/2018/wordml/cex" xmlns:w16cid="http://schemas.microsoft.com/office/word/2016/wordml/cid" xmlns:w16="http://schemas.microsoft.com/office/word/2018/wordml" xmlns:w16sdtdh="http://schemas.microsoft.com/office/word/2020/wordml/sdtdatahash" xmlns:w16se="http://schemas.microsoft.com/office/word/2015/wordml/symex" xmlns:wpg="http://schemas.microsoft.com/office/word/2010/wordprocessingGroup" xmlns:wpi="http://schemas.microsoft.com/office/word/2010/wordprocessingInk" xmlns:wne="http://schemas.microsoft.com/office/word/2006/wordml" xmlns:wps="http://schemas.microsoft.com/office/word/2010/wordprocessingShape" mc:Ignorable="w14 w15 w16se w16cid w16 w16cex w16sdtdh wp14">
+<w:numbering xmlns:wpc="http://schemas.microsoft.com/office/word/2010/wordprocessingCanvas" xmlns:cx="http://schemas.microsoft.com/office/drawing/2014/chartex" xmlns:cx1="http://schemas.microsoft.com/office/drawing/2015/9/8/chartex" xmlns:cx2="http://schemas.microsoft.com/office/drawing/2015/10/21/chartex" xmlns:cx3="http://schemas.microsoft.com/office/drawing/2016/5/9/chartex" xmlns:cx4="http://schemas.microsoft.com/office/drawing/2016/5/10/chartex" xmlns:cx5="http://schemas.microsoft.com/office/drawing/2016/5/11/chartex" xmlns:cx6="http://schemas.microsoft.com/office/drawing/2016/5/12/chartex" xmlns:cx7="http://schemas.microsoft.com/office/drawing/2016/5/13/chartex" xmlns:cx8="http://schemas.microsoft.com/office/drawing/2016/5/14/chartex" xmlns:mc="http://schemas.openxmlformats.org/markup-compatibility/2006" xmlns:aink="http://schemas.microsoft.com/office/drawing/2016/ink" xmlns:am3d="http://schemas.microsoft.com/office/drawing/2017/model3d" xmlns:o="urn:schemas-microsoft-com:office:office" xmlns:oel="http://schemas.microsoft.com/office/2019/extlst" xmlns:r="http://schemas.openxmlformats.org/officeDocument/2006/relationships" xmlns:m="http://schemas.openxmlformats.org/officeDocument/2006/math" xmlns:v="urn:schemas-microsoft-com:vml" xmlns:wp14="http://schemas.microsoft.com/office/word/2010/wordprocessingDrawing" xmlns:wp="http://schemas.openxmlformats.org/drawingml/2006/wordprocessingDrawing" xmlns:w10="urn:schemas-microsoft-com:office:word" xmlns:w="http://schemas.openxmlformats.org/wordprocessingml/2006/main" xmlns:w14="http://schemas.microsoft.com/office/word/2010/wordml" xmlns:w15="http://schemas.microsoft.com/office/word/2012/wordml" xmlns:w16cex="http://schemas.microsoft.com/office/word/2018/wordml/cex" xmlns:w16cid="http://schemas.microsoft.com/office/word/2016/wordml/cid" xmlns:w16="http://schemas.microsoft.com/office/word/2018/wordml" xmlns:w16du="http://schemas.microsoft.com/office/word/2023/wordml/word16du" xmlns:w16sdtdh="http://schemas.microsoft.com/office/word/2020/wordml/sdtdatahash" xmlns:w16se="http://schemas.microsoft.com/office/word/2015/wordml/symex" xmlns:wpg="http://schemas.microsoft.com/office/word/2010/wordprocessingGroup" xmlns:wpi="http://schemas.microsoft.com/office/word/2010/wordprocessingInk" xmlns:wne="http://schemas.microsoft.com/office/word/2006/wordml" xmlns:wps="http://schemas.microsoft.com/office/word/2010/wordprocessingShape" mc:Ignorable="w14 w15 w16se w16cid w16 w16cex w16sdtdh wp14">
   <w:abstractNum w:abstractNumId="0" w15:restartNumberingAfterBreak="0">
     <w:nsid w:val="19365752"/>
     <w:multiLevelType w:val="hybridMultilevel"/>
@@ -3654,16 +3491,16 @@
       <w:lvlJc w:val="left"/>
     </w:lvl>
   </w:abstractNum>
-  <w:num w:numId="1">
+  <w:num w:numId="1" w16cid:durableId="713236788">
     <w:abstractNumId w:val="2"/>
   </w:num>
-  <w:num w:numId="2">
+  <w:num w:numId="2" w16cid:durableId="323895352">
     <w:abstractNumId w:val="3"/>
   </w:num>
-  <w:num w:numId="3">
+  <w:num w:numId="3" w16cid:durableId="946883993">
     <w:abstractNumId w:val="1"/>
   </w:num>
-  <w:num w:numId="4">
+  <w:num w:numId="4" w16cid:durableId="1851531490">
     <w:abstractNumId w:val="0"/>
   </w:num>
 </w:numbering>

</xml_diff>